<commit_message>
Restructure Meta 2 report to match Meta 1 format
</commit_message>
<xml_diff>
--- a/docs/entregas/Relatorio_Meta2_CIBIR.docx
+++ b/docs/entregas/Relatorio_Meta2_CIBIR.docx
@@ -4,365 +4,114 @@
   <w:body>
     <w:p>
       <w:pPr>
-        <w:pStyle w:val="Title"/>
-        <w:spacing w:before="160"/>
+        <w:jc w:val="center"/>
       </w:pPr>
       <w:r>
-        <w:t>Relatorio da Meta 2</w:t>
+        <w:rPr>
+          <w:rFonts w:ascii="Calibri" w:hAnsi="Calibri"/>
+          <w:b/>
+          <w:sz w:val="22"/>
+        </w:rPr>
+        <w:t>Instituto Federal de Educacao, Ciencia e Tecnologia Goiano - Campus Urutai</w:t>
       </w:r>
     </w:p>
     <w:p>
       <w:pPr>
-        <w:pStyle w:val="Subtitle"/>
+        <w:jc w:val="center"/>
       </w:pPr>
       <w:r>
-        <w:t>Recuperacao fotografica por conteudo e reconhecimento facial</w:t>
+        <w:rPr>
+          <w:rFonts w:ascii="Calibri" w:hAnsi="Calibri"/>
+          <w:b w:val="0"/>
+          <w:sz w:val="22"/>
+        </w:rPr>
+        <w:t>Discente: Artur Duarte Monteiro</w:t>
       </w:r>
     </w:p>
-    <w:tbl>
-      <w:tblPr>
-        <w:tblW w:type="auto" w:w="0"/>
-        <w:jc w:val="left"/>
-        <w:tblLayout w:type="fixed"/>
-        <w:tblLook w:firstColumn="1" w:firstRow="1" w:lastColumn="0" w:lastRow="0" w:noHBand="0" w:noVBand="1" w:val="04A0"/>
-      </w:tblPr>
-      <w:tblGrid>
-        <w:gridCol w:w="4680"/>
-        <w:gridCol w:w="4680"/>
-      </w:tblGrid>
-      <w:tr>
-        <w:trPr>
-          <w:tblHeader w:val="true"/>
-        </w:trPr>
-        <w:tc>
-          <w:tcPr>
-            <w:tcW w:type="dxa" w:w="2088"/>
-            <w:tcMar>
-              <w:top w:w="80" w:type="dxa"/>
-              <w:bottom w:w="80" w:type="dxa"/>
-              <w:start w:w="120" w:type="dxa"/>
-              <w:end w:w="120" w:type="dxa"/>
-            </w:tcMar>
-            <w:tcBorders>
-              <w:top w:val="single" w:sz="4" w:space="0" w:color="D9DEE8"/>
-              <w:left w:val="single" w:sz="4" w:space="0" w:color="D9DEE8"/>
-              <w:bottom w:val="single" w:sz="4" w:space="0" w:color="D9DEE8"/>
-              <w:right w:val="single" w:sz="4" w:space="0" w:color="D9DEE8"/>
-            </w:tcBorders>
-            <w:vAlign w:val="center"/>
-            <w:shd w:fill="F2F4F7"/>
-          </w:tcPr>
-          <w:p>
-            <w:r>
-              <w:rPr>
-                <w:b/>
-              </w:rPr>
-              <w:t>Projeto</w:t>
-            </w:r>
-          </w:p>
-        </w:tc>
-        <w:tc>
-          <w:tcPr>
-            <w:tcW w:type="dxa" w:w="7272"/>
-            <w:tcMar>
-              <w:top w:w="80" w:type="dxa"/>
-              <w:bottom w:w="80" w:type="dxa"/>
-              <w:start w:w="120" w:type="dxa"/>
-              <w:end w:w="120" w:type="dxa"/>
-            </w:tcMar>
-            <w:tcBorders>
-              <w:top w:val="single" w:sz="4" w:space="0" w:color="D9DEE8"/>
-              <w:left w:val="single" w:sz="4" w:space="0" w:color="D9DEE8"/>
-              <w:bottom w:val="single" w:sz="4" w:space="0" w:color="D9DEE8"/>
-              <w:right w:val="single" w:sz="4" w:space="0" w:color="D9DEE8"/>
-            </w:tcBorders>
-            <w:vAlign w:val="center"/>
-          </w:tcPr>
-          <w:p>
-            <w:r>
-              <w:t>Busca inteligente em acervos fotograficos por face e CBIR global</w:t>
-            </w:r>
-          </w:p>
-        </w:tc>
-      </w:tr>
-      <w:tr>
-        <w:tc>
-          <w:tcPr>
-            <w:tcW w:type="dxa" w:w="2088"/>
-            <w:tcMar>
-              <w:top w:w="80" w:type="dxa"/>
-              <w:bottom w:w="80" w:type="dxa"/>
-              <w:start w:w="120" w:type="dxa"/>
-              <w:end w:w="120" w:type="dxa"/>
-            </w:tcMar>
-            <w:tcBorders>
-              <w:top w:val="single" w:sz="4" w:space="0" w:color="D9DEE8"/>
-              <w:left w:val="single" w:sz="4" w:space="0" w:color="D9DEE8"/>
-              <w:bottom w:val="single" w:sz="4" w:space="0" w:color="D9DEE8"/>
-              <w:right w:val="single" w:sz="4" w:space="0" w:color="D9DEE8"/>
-            </w:tcBorders>
-            <w:vAlign w:val="center"/>
-            <w:shd w:fill="F2F4F7"/>
-          </w:tcPr>
-          <w:p>
-            <w:r>
-              <w:rPr>
-                <w:b/>
-              </w:rPr>
-              <w:t>Responsavel</w:t>
-            </w:r>
-          </w:p>
-        </w:tc>
-        <w:tc>
-          <w:tcPr>
-            <w:tcW w:type="dxa" w:w="7272"/>
-            <w:tcMar>
-              <w:top w:w="80" w:type="dxa"/>
-              <w:bottom w:w="80" w:type="dxa"/>
-              <w:start w:w="120" w:type="dxa"/>
-              <w:end w:w="120" w:type="dxa"/>
-            </w:tcMar>
-            <w:tcBorders>
-              <w:top w:val="single" w:sz="4" w:space="0" w:color="D9DEE8"/>
-              <w:left w:val="single" w:sz="4" w:space="0" w:color="D9DEE8"/>
-              <w:bottom w:val="single" w:sz="4" w:space="0" w:color="D9DEE8"/>
-              <w:right w:val="single" w:sz="4" w:space="0" w:color="D9DEE8"/>
-            </w:tcBorders>
-            <w:vAlign w:val="center"/>
-          </w:tcPr>
-          <w:p>
-            <w:r>
-              <w:t>Artur Duarte</w:t>
-            </w:r>
-          </w:p>
-        </w:tc>
-      </w:tr>
-      <w:tr>
-        <w:tc>
-          <w:tcPr>
-            <w:tcW w:type="dxa" w:w="2088"/>
-            <w:tcMar>
-              <w:top w:w="80" w:type="dxa"/>
-              <w:bottom w:w="80" w:type="dxa"/>
-              <w:start w:w="120" w:type="dxa"/>
-              <w:end w:w="120" w:type="dxa"/>
-            </w:tcMar>
-            <w:tcBorders>
-              <w:top w:val="single" w:sz="4" w:space="0" w:color="D9DEE8"/>
-              <w:left w:val="single" w:sz="4" w:space="0" w:color="D9DEE8"/>
-              <w:bottom w:val="single" w:sz="4" w:space="0" w:color="D9DEE8"/>
-              <w:right w:val="single" w:sz="4" w:space="0" w:color="D9DEE8"/>
-            </w:tcBorders>
-            <w:vAlign w:val="center"/>
-            <w:shd w:fill="F2F4F7"/>
-          </w:tcPr>
-          <w:p>
-            <w:r>
-              <w:rPr>
-                <w:b/>
-              </w:rPr>
-              <w:t>Data</w:t>
-            </w:r>
-          </w:p>
-        </w:tc>
-        <w:tc>
-          <w:tcPr>
-            <w:tcW w:type="dxa" w:w="7272"/>
-            <w:tcMar>
-              <w:top w:w="80" w:type="dxa"/>
-              <w:bottom w:w="80" w:type="dxa"/>
-              <w:start w:w="120" w:type="dxa"/>
-              <w:end w:w="120" w:type="dxa"/>
-            </w:tcMar>
-            <w:tcBorders>
-              <w:top w:val="single" w:sz="4" w:space="0" w:color="D9DEE8"/>
-              <w:left w:val="single" w:sz="4" w:space="0" w:color="D9DEE8"/>
-              <w:bottom w:val="single" w:sz="4" w:space="0" w:color="D9DEE8"/>
-              <w:right w:val="single" w:sz="4" w:space="0" w:color="D9DEE8"/>
-            </w:tcBorders>
-            <w:vAlign w:val="center"/>
-          </w:tcPr>
-          <w:p>
-            <w:r>
-              <w:t>25/06/2026</w:t>
-            </w:r>
-          </w:p>
-        </w:tc>
-      </w:tr>
-      <w:tr>
-        <w:tc>
-          <w:tcPr>
-            <w:tcW w:type="dxa" w:w="2088"/>
-            <w:tcMar>
-              <w:top w:w="80" w:type="dxa"/>
-              <w:bottom w:w="80" w:type="dxa"/>
-              <w:start w:w="120" w:type="dxa"/>
-              <w:end w:w="120" w:type="dxa"/>
-            </w:tcMar>
-            <w:tcBorders>
-              <w:top w:val="single" w:sz="4" w:space="0" w:color="D9DEE8"/>
-              <w:left w:val="single" w:sz="4" w:space="0" w:color="D9DEE8"/>
-              <w:bottom w:val="single" w:sz="4" w:space="0" w:color="D9DEE8"/>
-              <w:right w:val="single" w:sz="4" w:space="0" w:color="D9DEE8"/>
-            </w:tcBorders>
-            <w:vAlign w:val="center"/>
-            <w:shd w:fill="F2F4F7"/>
-          </w:tcPr>
-          <w:p>
-            <w:r>
-              <w:rPr>
-                <w:b/>
-              </w:rPr>
-              <w:t>Status</w:t>
-            </w:r>
-          </w:p>
-        </w:tc>
-        <w:tc>
-          <w:tcPr>
-            <w:tcW w:type="dxa" w:w="7272"/>
-            <w:tcMar>
-              <w:top w:w="80" w:type="dxa"/>
-              <w:bottom w:w="80" w:type="dxa"/>
-              <w:start w:w="120" w:type="dxa"/>
-              <w:end w:w="120" w:type="dxa"/>
-            </w:tcMar>
-            <w:tcBorders>
-              <w:top w:val="single" w:sz="4" w:space="0" w:color="D9DEE8"/>
-              <w:left w:val="single" w:sz="4" w:space="0" w:color="D9DEE8"/>
-              <w:bottom w:val="single" w:sz="4" w:space="0" w:color="D9DEE8"/>
-              <w:right w:val="single" w:sz="4" w:space="0" w:color="D9DEE8"/>
-            </w:tcBorders>
-            <w:vAlign w:val="center"/>
-          </w:tcPr>
-          <w:p>
-            <w:r>
-              <w:t>Versao consolidada para entrega e base para artigo</w:t>
-            </w:r>
-          </w:p>
-        </w:tc>
-      </w:tr>
-    </w:tbl>
     <w:p>
       <w:pPr>
-        <w:pStyle w:val="Heading1"/>
+        <w:jc w:val="center"/>
       </w:pPr>
       <w:r>
-        <w:t>Resumo executivo</w:t>
+        <w:rPr>
+          <w:rFonts w:ascii="Calibri" w:hAnsi="Calibri"/>
+          <w:b w:val="0"/>
+          <w:sz w:val="22"/>
+        </w:rPr>
+        <w:t>Orientador: Gabriel da Silva Vieira</w:t>
+      </w:r>
+    </w:p>
+    <w:p/>
+    <w:p/>
+    <w:p/>
+    <w:p/>
+    <w:p/>
+    <w:p/>
+    <w:p/>
+    <w:p/>
+    <w:p>
+      <w:pPr>
+        <w:jc w:val="center"/>
+      </w:pPr>
+      <w:r>
+        <w:rPr>
+          <w:rFonts w:ascii="Calibri" w:hAnsi="Calibri"/>
+          <w:b/>
+          <w:sz w:val="36"/>
+        </w:rPr>
+        <w:t>Relatorio Meta 2</w:t>
+      </w:r>
+    </w:p>
+    <w:p>
+      <w:pPr>
+        <w:jc w:val="center"/>
+      </w:pPr>
+      <w:r>
+        <w:rPr>
+          <w:rFonts w:ascii="Calibri" w:hAnsi="Calibri"/>
+          <w:b/>
+          <w:sz w:val="26"/>
+        </w:rPr>
+        <w:t>Recuperacao de Imagens Fotograficas por Conteudo e Reconhecimento Facial em Colecoes de Grande Escala</w:t>
+      </w:r>
+    </w:p>
+    <w:p>
+      <w:pPr>
+        <w:jc w:val="center"/>
+      </w:pPr>
+      <w:r>
+        <w:rPr>
+          <w:rFonts w:ascii="Calibri" w:hAnsi="Calibri"/>
+          <w:color w:val="666666"/>
+          <w:sz w:val="22"/>
+        </w:rPr>
+        <w:t>Busca facial multi-rosto, CBIR global com ResNet50 e fusao tardia de scores</w:t>
+      </w:r>
+    </w:p>
+    <w:p/>
+    <w:p/>
+    <w:p/>
+    <w:p/>
+    <w:p/>
+    <w:p/>
+    <w:p/>
+    <w:p/>
+    <w:p/>
+    <w:p>
+      <w:pPr>
+        <w:jc w:val="center"/>
+      </w:pPr>
+      <w:r>
+        <w:rPr>
+          <w:rFonts w:ascii="Calibri" w:hAnsi="Calibri"/>
+          <w:sz w:val="22"/>
+        </w:rPr>
+        <w:t>Urutai - GO, 2026</w:t>
       </w:r>
     </w:p>
     <w:p>
       <w:r>
-        <w:t>Esta Meta 2 consolidou uma versao funcional e avaliada do sistema de recuperacao fotografica. O sistema indexa multiplos rostos por foto, retorna fotos completas para consultas por pessoa, extrai descritores globais com ResNet50 para busca por imagem inteira e compara esses resultados com uma fusao tardia de scores.</w:t>
-      </w:r>
-    </w:p>
-    <w:tbl>
-      <w:tblPr>
-        <w:tblW w:type="auto" w:w="0"/>
-        <w:jc w:val="left"/>
-        <w:tblLayout w:type="fixed"/>
-        <w:tblLook w:firstColumn="1" w:firstRow="1" w:lastColumn="0" w:lastRow="0" w:noHBand="0" w:noVBand="1" w:val="04A0"/>
-      </w:tblPr>
-      <w:tblGrid>
-        <w:gridCol w:w="9360"/>
-      </w:tblGrid>
-      <w:tr>
-        <w:trPr>
-          <w:tblHeader w:val="true"/>
-        </w:trPr>
-        <w:tc>
-          <w:tcPr>
-            <w:tcW w:type="dxa" w:w="9360"/>
-            <w:tcMar>
-              <w:top w:w="80" w:type="dxa"/>
-              <w:bottom w:w="80" w:type="dxa"/>
-              <w:start w:w="120" w:type="dxa"/>
-              <w:end w:w="120" w:type="dxa"/>
-            </w:tcMar>
-            <w:tcBorders>
-              <w:top w:val="single" w:sz="4" w:space="0" w:color="D9DEE8"/>
-              <w:left w:val="single" w:sz="4" w:space="0" w:color="D9DEE8"/>
-              <w:bottom w:val="single" w:sz="4" w:space="0" w:color="D9DEE8"/>
-              <w:right w:val="single" w:sz="4" w:space="0" w:color="D9DEE8"/>
-            </w:tcBorders>
-            <w:vAlign w:val="center"/>
-            <w:shd w:fill="EAF4EA"/>
-          </w:tcPr>
-          <w:p>
-            <w:r>
-              <w:rPr>
-                <w:b/>
-              </w:rPr>
-              <w:t xml:space="preserve">Resultado central: </w:t>
-            </w:r>
-            <w:r>
-              <w:t>A busca facial foi a melhor estrategia para recuperar pessoas no conjunto Gallagher; a busca global foi adequada para similaridade visual no INRIA Holidays; a fusao simples nao superou a busca facial isolada em consultas centradas em identidade, o que gera uma discussao cientifica relevante.</w:t>
-            </w:r>
-          </w:p>
-        </w:tc>
-      </w:tr>
-    </w:tbl>
-    <w:p>
-      <w:pPr>
-        <w:pStyle w:val="Heading1"/>
-      </w:pPr>
-      <w:r>
-        <w:t>O que foi entregue</w:t>
-      </w:r>
-    </w:p>
-    <w:p>
-      <w:pPr>
-        <w:pStyle w:val="ListBullet"/>
-      </w:pPr>
-      <w:r>
-        <w:t>Reorganizacao do projeto para scripts novos e modulares, sem depender da estrutura antiga.</w:t>
-      </w:r>
-    </w:p>
-    <w:p>
-      <w:pPr>
-        <w:pStyle w:val="ListBullet"/>
-      </w:pPr>
-      <w:r>
-        <w:t>Indice facial multi-rosto, no qual uma imagem pode gerar varios embeddings faciais.</w:t>
-      </w:r>
-    </w:p>
-    <w:p>
-      <w:pPr>
-        <w:pStyle w:val="ListBullet"/>
-      </w:pPr>
-      <w:r>
-        <w:t>Busca por pessoa a partir de uma foto comum, retornando a fotografia inteira e nao apenas o recorte do rosto.</w:t>
-      </w:r>
-    </w:p>
-    <w:p>
-      <w:pPr>
-        <w:pStyle w:val="ListBullet"/>
-      </w:pPr>
-      <w:r>
-        <w:t>Indice global com ResNet50 pre-treinada para recuperar imagens visualmente semelhantes pela imagem inteira.</w:t>
-      </w:r>
-    </w:p>
-    <w:p>
-      <w:pPr>
-        <w:pStyle w:val="ListBullet"/>
-      </w:pPr>
-      <w:r>
-        <w:t>Avaliacao facial no Gallagher, avaliacao global no INRIA Holidays e comparacao face/global/fusao.</w:t>
-      </w:r>
-    </w:p>
-    <w:p>
-      <w:pPr>
-        <w:pStyle w:val="ListBullet"/>
-      </w:pPr>
-      <w:r>
-        <w:t>Interface minima em Streamlit para demonstrar busca por pessoa, busca global e fusao.</w:t>
-      </w:r>
-    </w:p>
-    <w:p>
-      <w:pPr>
-        <w:pStyle w:val="ListBullet"/>
-      </w:pPr>
-      <w:r>
-        <w:t>Curadoria bibliografica inicial para sustentar a escrita de artigo, TCC ou relatorio de IC.</w:t>
+        <w:br w:type="page"/>
       </w:r>
     </w:p>
     <w:p>
@@ -370,12 +119,82 @@
         <w:pStyle w:val="Heading1"/>
       </w:pPr>
       <w:r>
-        <w:t>Metodologia resumida</w:t>
+        <w:t>1 Introducao</w:t>
       </w:r>
     </w:p>
     <w:p>
       <w:r>
-        <w:t>A abordagem foi separada em duas trilhas. A trilha facial detecta rostos, gera embeddings e compara esses vetores por similaridade cosseno. A trilha global usa uma ResNet50 pre-treinada para gerar um embedding de 2048 dimensoes da imagem inteira. A fusao combina os scores das duas trilhas por soma ponderada, testando pesos 0.9/0.1, 0.7/0.3 e 0.5/0.5.</w:t>
+        <w:t>Este relatorio descreve as atividades executadas na Meta 2 do projeto, com foco na consolidacao de um sistema reprodutivel de recuperacao fotografica por conteudo. Nesta etapa, o projeto deixou de ser apenas um conjunto de scripts exploratorios e passou a possuir modulos separados para busca facial, busca global da imagem inteira e fusao tardia de scores.</w:t>
+      </w:r>
+    </w:p>
+    <w:p>
+      <w:r>
+        <w:t>O objetivo tecnico da Meta 2 foi implementar e avaliar tres estrategias de recuperacao: busca por pessoa com embeddings faciais, busca por similaridade visual com descritores globais ResNet50 e combinacao ponderada entre as duas trilhas. O resultado esperado e uma base concreta para relatorio, TCC ou artigo curto, com metricas objetivas e exemplos visuais.</w:t>
+      </w:r>
+    </w:p>
+    <w:p>
+      <w:pPr>
+        <w:pStyle w:val="Heading1"/>
+      </w:pPr>
+      <w:r>
+        <w:t>2 Metodologia</w:t>
+      </w:r>
+    </w:p>
+    <w:p>
+      <w:pPr>
+        <w:pStyle w:val="Heading2"/>
+      </w:pPr>
+      <w:r>
+        <w:t>2.1 Organizacao do sistema</w:t>
+      </w:r>
+    </w:p>
+    <w:p>
+      <w:r>
+        <w:t>A implementacao foi organizada em diretorios por responsabilidade. A pasta scripts/face contem os programas de indexacao, busca e avaliacao facial. A pasta scripts/global contem os scripts de CBIR global com ResNet50. A pasta scripts/fusion contem a combinacao dos rankings, enquanto scripts/app armazena a interface minima em Streamlit.</w:t>
+      </w:r>
+    </w:p>
+    <w:p>
+      <w:r>
+        <w:t>Essa separacao foi adotada para permitir a avaliacao isolada de cada modulo antes da fusao. Assim, quando um resultado melhora ou piora, e possivel identificar se a causa esta no modulo facial, no modulo global ou na regra de combinacao.</w:t>
+      </w:r>
+    </w:p>
+    <w:p>
+      <w:pPr>
+        <w:pStyle w:val="Heading2"/>
+      </w:pPr>
+      <w:r>
+        <w:t>2.2 Indice facial multi-rosto</w:t>
+      </w:r>
+    </w:p>
+    <w:p>
+      <w:r>
+        <w:t>O indice facial foi construido considerando que uma mesma fotografia pode conter varias pessoas. Portanto, a unidade indexada nao e a imagem inteira, mas cada rosto detectado dentro da imagem. Cada face recebe um embedding proprio e metadados que apontam para a fotografia original, incluindo identificador da imagem, posicao do rosto e linha correspondente no arquivo de embeddings.</w:t>
+      </w:r>
+    </w:p>
+    <w:p>
+      <w:pPr>
+        <w:pStyle w:val="Heading2"/>
+      </w:pPr>
+      <w:r>
+        <w:t>2.3 CBIR global com ResNet50</w:t>
+      </w:r>
+    </w:p>
+    <w:p>
+      <w:r>
+        <w:t>Para a busca global, cada fotografia inteira foi processada por uma ResNet50 pre-treinada. O vetor extraido representa o conteudo visual geral da imagem, incluindo cena, composicao, objetos e padroes visuais. Esse modulo foi mantido separado do facial porque ele responde a uma pergunta diferente: quais imagens sao visualmente semelhantes a imagem de consulta.</w:t>
+      </w:r>
+    </w:p>
+    <w:p>
+      <w:pPr>
+        <w:pStyle w:val="Heading2"/>
+      </w:pPr>
+      <w:r>
+        <w:t>2.4 Fusao tardia de scores</w:t>
+      </w:r>
+    </w:p>
+    <w:p>
+      <w:r>
+        <w:t>A fusao foi implementada como late fusion, ou fusao tardia. Em vez de concatenar embeddings faciais e globais, que possuem significados diferentes, o sistema combina os scores finais de similaridade. Foram testados os pesos 0.9/0.1, 0.7/0.3 e 0.5/0.5 para face/global.</w:t>
       </w:r>
     </w:p>
     <w:tbl>
@@ -910,7 +729,12 @@
         <w:pStyle w:val="Heading1"/>
       </w:pPr>
       <w:r>
-        <w:t>Bases e indices usados</w:t>
+        <w:t>3 Bases de dados e organizacao experimental</w:t>
+      </w:r>
+    </w:p>
+    <w:p>
+      <w:r>
+        <w:t>A avaliacao foi dividida por tarefa para evitar conclusoes incorretas. A base LFW foi usada como validacao inicial de reconhecimento facial. A base Gallagher foi usada para busca por pessoas em fotografias de grupo e para avaliacao da fusao. A base INRIA Holidays foi usada para avaliar a busca global por similaridade visual de imagem inteira.</w:t>
       </w:r>
     </w:p>
     <w:tbl>
@@ -1381,7 +1205,696 @@
         <w:pStyle w:val="Heading1"/>
       </w:pPr>
       <w:r>
-        <w:t>Resultados quantitativos</w:t>
+        <w:t>4 Implementacao dos modulos</w:t>
+      </w:r>
+    </w:p>
+    <w:p>
+      <w:r>
+        <w:t>A Meta 2 gerou scripts novos e reprodutiveis para indexacao, busca, avaliacao e demonstracao. Os scripts principais aceitam parametros por linha de comando, como diretorio de entrada, diretorio de saida, dispositivo de execucao, Top-K e limiar de similaridade.</w:t>
+      </w:r>
+    </w:p>
+    <w:tbl>
+      <w:tblPr>
+        <w:tblW w:type="auto" w:w="0"/>
+        <w:jc w:val="left"/>
+        <w:tblLayout w:type="fixed"/>
+        <w:tblLook w:firstColumn="1" w:firstRow="1" w:lastColumn="0" w:lastRow="0" w:noHBand="0" w:noVBand="1" w:val="04A0"/>
+      </w:tblPr>
+      <w:tblGrid>
+        <w:gridCol w:w="3120"/>
+        <w:gridCol w:w="3120"/>
+        <w:gridCol w:w="3120"/>
+      </w:tblGrid>
+      <w:tr>
+        <w:trPr>
+          <w:tblHeader w:val="true"/>
+        </w:trPr>
+        <w:tc>
+          <w:tcPr>
+            <w:tcW w:type="dxa" w:w="3096"/>
+            <w:tcMar>
+              <w:top w:w="80" w:type="dxa"/>
+              <w:bottom w:w="80" w:type="dxa"/>
+              <w:start w:w="120" w:type="dxa"/>
+              <w:end w:w="120" w:type="dxa"/>
+            </w:tcMar>
+            <w:tcBorders>
+              <w:top w:val="single" w:sz="4" w:space="0" w:color="D9DEE8"/>
+              <w:left w:val="single" w:sz="4" w:space="0" w:color="D9DEE8"/>
+              <w:bottom w:val="single" w:sz="4" w:space="0" w:color="D9DEE8"/>
+              <w:right w:val="single" w:sz="4" w:space="0" w:color="D9DEE8"/>
+            </w:tcBorders>
+            <w:vAlign w:val="center"/>
+            <w:shd w:fill="F2F4F7"/>
+          </w:tcPr>
+          <w:p>
+            <w:pPr>
+              <w:jc w:val="left"/>
+            </w:pPr>
+            <w:r>
+              <w:rPr>
+                <w:b/>
+              </w:rPr>
+              <w:t>Script</w:t>
+            </w:r>
+          </w:p>
+        </w:tc>
+        <w:tc>
+          <w:tcPr>
+            <w:tcW w:type="dxa" w:w="3528"/>
+            <w:tcMar>
+              <w:top w:w="80" w:type="dxa"/>
+              <w:bottom w:w="80" w:type="dxa"/>
+              <w:start w:w="120" w:type="dxa"/>
+              <w:end w:w="120" w:type="dxa"/>
+            </w:tcMar>
+            <w:tcBorders>
+              <w:top w:val="single" w:sz="4" w:space="0" w:color="D9DEE8"/>
+              <w:left w:val="single" w:sz="4" w:space="0" w:color="D9DEE8"/>
+              <w:bottom w:val="single" w:sz="4" w:space="0" w:color="D9DEE8"/>
+              <w:right w:val="single" w:sz="4" w:space="0" w:color="D9DEE8"/>
+            </w:tcBorders>
+            <w:vAlign w:val="center"/>
+            <w:shd w:fill="F2F4F7"/>
+          </w:tcPr>
+          <w:p>
+            <w:pPr>
+              <w:jc w:val="left"/>
+            </w:pPr>
+            <w:r>
+              <w:rPr>
+                <w:b/>
+              </w:rPr>
+              <w:t>Funcao</w:t>
+            </w:r>
+          </w:p>
+        </w:tc>
+        <w:tc>
+          <w:tcPr>
+            <w:tcW w:type="dxa" w:w="2736"/>
+            <w:tcMar>
+              <w:top w:w="80" w:type="dxa"/>
+              <w:bottom w:w="80" w:type="dxa"/>
+              <w:start w:w="120" w:type="dxa"/>
+              <w:end w:w="120" w:type="dxa"/>
+            </w:tcMar>
+            <w:tcBorders>
+              <w:top w:val="single" w:sz="4" w:space="0" w:color="D9DEE8"/>
+              <w:left w:val="single" w:sz="4" w:space="0" w:color="D9DEE8"/>
+              <w:bottom w:val="single" w:sz="4" w:space="0" w:color="D9DEE8"/>
+              <w:right w:val="single" w:sz="4" w:space="0" w:color="D9DEE8"/>
+            </w:tcBorders>
+            <w:vAlign w:val="center"/>
+            <w:shd w:fill="F2F4F7"/>
+          </w:tcPr>
+          <w:p>
+            <w:pPr>
+              <w:jc w:val="left"/>
+            </w:pPr>
+            <w:r>
+              <w:rPr>
+                <w:b/>
+              </w:rPr>
+              <w:t>Saida principal</w:t>
+            </w:r>
+          </w:p>
+        </w:tc>
+      </w:tr>
+      <w:tr>
+        <w:tc>
+          <w:tcPr>
+            <w:tcW w:type="dxa" w:w="3096"/>
+            <w:tcMar>
+              <w:top w:w="80" w:type="dxa"/>
+              <w:bottom w:w="80" w:type="dxa"/>
+              <w:start w:w="120" w:type="dxa"/>
+              <w:end w:w="120" w:type="dxa"/>
+            </w:tcMar>
+            <w:tcBorders>
+              <w:top w:val="single" w:sz="4" w:space="0" w:color="D9DEE8"/>
+              <w:left w:val="single" w:sz="4" w:space="0" w:color="D9DEE8"/>
+              <w:bottom w:val="single" w:sz="4" w:space="0" w:color="D9DEE8"/>
+              <w:right w:val="single" w:sz="4" w:space="0" w:color="D9DEE8"/>
+            </w:tcBorders>
+            <w:vAlign w:val="center"/>
+          </w:tcPr>
+          <w:p>
+            <w:r>
+              <w:t>scripts/face/01_index_faces.py</w:t>
+            </w:r>
+          </w:p>
+        </w:tc>
+        <w:tc>
+          <w:tcPr>
+            <w:tcW w:type="dxa" w:w="3528"/>
+            <w:tcMar>
+              <w:top w:w="80" w:type="dxa"/>
+              <w:bottom w:w="80" w:type="dxa"/>
+              <w:start w:w="120" w:type="dxa"/>
+              <w:end w:w="120" w:type="dxa"/>
+            </w:tcMar>
+            <w:tcBorders>
+              <w:top w:val="single" w:sz="4" w:space="0" w:color="D9DEE8"/>
+              <w:left w:val="single" w:sz="4" w:space="0" w:color="D9DEE8"/>
+              <w:bottom w:val="single" w:sz="4" w:space="0" w:color="D9DEE8"/>
+              <w:right w:val="single" w:sz="4" w:space="0" w:color="D9DEE8"/>
+            </w:tcBorders>
+            <w:vAlign w:val="center"/>
+          </w:tcPr>
+          <w:p>
+            <w:r>
+              <w:t>Detecta todos os rostos e gera embeddings faciais.</w:t>
+            </w:r>
+          </w:p>
+        </w:tc>
+        <w:tc>
+          <w:tcPr>
+            <w:tcW w:type="dxa" w:w="2736"/>
+            <w:tcMar>
+              <w:top w:w="80" w:type="dxa"/>
+              <w:bottom w:w="80" w:type="dxa"/>
+              <w:start w:w="120" w:type="dxa"/>
+              <w:end w:w="120" w:type="dxa"/>
+            </w:tcMar>
+            <w:tcBorders>
+              <w:top w:val="single" w:sz="4" w:space="0" w:color="D9DEE8"/>
+              <w:left w:val="single" w:sz="4" w:space="0" w:color="D9DEE8"/>
+              <w:bottom w:val="single" w:sz="4" w:space="0" w:color="D9DEE8"/>
+              <w:right w:val="single" w:sz="4" w:space="0" w:color="D9DEE8"/>
+            </w:tcBorders>
+            <w:vAlign w:val="center"/>
+          </w:tcPr>
+          <w:p>
+            <w:r>
+              <w:t>outputs/face_index*/face_embeddings.npy</w:t>
+            </w:r>
+          </w:p>
+        </w:tc>
+      </w:tr>
+      <w:tr>
+        <w:tc>
+          <w:tcPr>
+            <w:tcW w:type="dxa" w:w="3096"/>
+            <w:tcMar>
+              <w:top w:w="80" w:type="dxa"/>
+              <w:bottom w:w="80" w:type="dxa"/>
+              <w:start w:w="120" w:type="dxa"/>
+              <w:end w:w="120" w:type="dxa"/>
+            </w:tcMar>
+            <w:tcBorders>
+              <w:top w:val="single" w:sz="4" w:space="0" w:color="D9DEE8"/>
+              <w:left w:val="single" w:sz="4" w:space="0" w:color="D9DEE8"/>
+              <w:bottom w:val="single" w:sz="4" w:space="0" w:color="D9DEE8"/>
+              <w:right w:val="single" w:sz="4" w:space="0" w:color="D9DEE8"/>
+            </w:tcBorders>
+            <w:vAlign w:val="center"/>
+          </w:tcPr>
+          <w:p>
+            <w:r>
+              <w:t>scripts/face/02_search_person.py</w:t>
+            </w:r>
+          </w:p>
+        </w:tc>
+        <w:tc>
+          <w:tcPr>
+            <w:tcW w:type="dxa" w:w="3528"/>
+            <w:tcMar>
+              <w:top w:w="80" w:type="dxa"/>
+              <w:bottom w:w="80" w:type="dxa"/>
+              <w:start w:w="120" w:type="dxa"/>
+              <w:end w:w="120" w:type="dxa"/>
+            </w:tcMar>
+            <w:tcBorders>
+              <w:top w:val="single" w:sz="4" w:space="0" w:color="D9DEE8"/>
+              <w:left w:val="single" w:sz="4" w:space="0" w:color="D9DEE8"/>
+              <w:bottom w:val="single" w:sz="4" w:space="0" w:color="D9DEE8"/>
+              <w:right w:val="single" w:sz="4" w:space="0" w:color="D9DEE8"/>
+            </w:tcBorders>
+            <w:vAlign w:val="center"/>
+          </w:tcPr>
+          <w:p>
+            <w:r>
+              <w:t>Busca uma pessoa a partir de uma imagem de consulta.</w:t>
+            </w:r>
+          </w:p>
+        </w:tc>
+        <w:tc>
+          <w:tcPr>
+            <w:tcW w:type="dxa" w:w="2736"/>
+            <w:tcMar>
+              <w:top w:w="80" w:type="dxa"/>
+              <w:bottom w:w="80" w:type="dxa"/>
+              <w:start w:w="120" w:type="dxa"/>
+              <w:end w:w="120" w:type="dxa"/>
+            </w:tcMar>
+            <w:tcBorders>
+              <w:top w:val="single" w:sz="4" w:space="0" w:color="D9DEE8"/>
+              <w:left w:val="single" w:sz="4" w:space="0" w:color="D9DEE8"/>
+              <w:bottom w:val="single" w:sz="4" w:space="0" w:color="D9DEE8"/>
+              <w:right w:val="single" w:sz="4" w:space="0" w:color="D9DEE8"/>
+            </w:tcBorders>
+            <w:vAlign w:val="center"/>
+          </w:tcPr>
+          <w:p>
+            <w:r>
+              <w:t>topk_results.csv e exemplos visuais</w:t>
+            </w:r>
+          </w:p>
+        </w:tc>
+      </w:tr>
+      <w:tr>
+        <w:tc>
+          <w:tcPr>
+            <w:tcW w:type="dxa" w:w="3096"/>
+            <w:tcMar>
+              <w:top w:w="80" w:type="dxa"/>
+              <w:bottom w:w="80" w:type="dxa"/>
+              <w:start w:w="120" w:type="dxa"/>
+              <w:end w:w="120" w:type="dxa"/>
+            </w:tcMar>
+            <w:tcBorders>
+              <w:top w:val="single" w:sz="4" w:space="0" w:color="D9DEE8"/>
+              <w:left w:val="single" w:sz="4" w:space="0" w:color="D9DEE8"/>
+              <w:bottom w:val="single" w:sz="4" w:space="0" w:color="D9DEE8"/>
+              <w:right w:val="single" w:sz="4" w:space="0" w:color="D9DEE8"/>
+            </w:tcBorders>
+            <w:vAlign w:val="center"/>
+          </w:tcPr>
+          <w:p>
+            <w:r>
+              <w:t>scripts/face/03_evaluate_face.py</w:t>
+            </w:r>
+          </w:p>
+        </w:tc>
+        <w:tc>
+          <w:tcPr>
+            <w:tcW w:type="dxa" w:w="3528"/>
+            <w:tcMar>
+              <w:top w:w="80" w:type="dxa"/>
+              <w:bottom w:w="80" w:type="dxa"/>
+              <w:start w:w="120" w:type="dxa"/>
+              <w:end w:w="120" w:type="dxa"/>
+            </w:tcMar>
+            <w:tcBorders>
+              <w:top w:val="single" w:sz="4" w:space="0" w:color="D9DEE8"/>
+              <w:left w:val="single" w:sz="4" w:space="0" w:color="D9DEE8"/>
+              <w:bottom w:val="single" w:sz="4" w:space="0" w:color="D9DEE8"/>
+              <w:right w:val="single" w:sz="4" w:space="0" w:color="D9DEE8"/>
+            </w:tcBorders>
+            <w:vAlign w:val="center"/>
+          </w:tcPr>
+          <w:p>
+            <w:r>
+              <w:t>Avalia Precision@K, Recall@K, mAP e tempo.</w:t>
+            </w:r>
+          </w:p>
+        </w:tc>
+        <w:tc>
+          <w:tcPr>
+            <w:tcW w:type="dxa" w:w="2736"/>
+            <w:tcMar>
+              <w:top w:w="80" w:type="dxa"/>
+              <w:bottom w:w="80" w:type="dxa"/>
+              <w:start w:w="120" w:type="dxa"/>
+              <w:end w:w="120" w:type="dxa"/>
+            </w:tcMar>
+            <w:tcBorders>
+              <w:top w:val="single" w:sz="4" w:space="0" w:color="D9DEE8"/>
+              <w:left w:val="single" w:sz="4" w:space="0" w:color="D9DEE8"/>
+              <w:bottom w:val="single" w:sz="4" w:space="0" w:color="D9DEE8"/>
+              <w:right w:val="single" w:sz="4" w:space="0" w:color="D9DEE8"/>
+            </w:tcBorders>
+            <w:vAlign w:val="center"/>
+          </w:tcPr>
+          <w:p>
+            <w:r>
+              <w:t>outputs/reports/*face*</w:t>
+            </w:r>
+          </w:p>
+        </w:tc>
+      </w:tr>
+      <w:tr>
+        <w:tc>
+          <w:tcPr>
+            <w:tcW w:type="dxa" w:w="3096"/>
+            <w:tcMar>
+              <w:top w:w="80" w:type="dxa"/>
+              <w:bottom w:w="80" w:type="dxa"/>
+              <w:start w:w="120" w:type="dxa"/>
+              <w:end w:w="120" w:type="dxa"/>
+            </w:tcMar>
+            <w:tcBorders>
+              <w:top w:val="single" w:sz="4" w:space="0" w:color="D9DEE8"/>
+              <w:left w:val="single" w:sz="4" w:space="0" w:color="D9DEE8"/>
+              <w:bottom w:val="single" w:sz="4" w:space="0" w:color="D9DEE8"/>
+              <w:right w:val="single" w:sz="4" w:space="0" w:color="D9DEE8"/>
+            </w:tcBorders>
+            <w:vAlign w:val="center"/>
+          </w:tcPr>
+          <w:p>
+            <w:r>
+              <w:t>scripts/global/01_index_global_resnet.py</w:t>
+            </w:r>
+          </w:p>
+        </w:tc>
+        <w:tc>
+          <w:tcPr>
+            <w:tcW w:type="dxa" w:w="3528"/>
+            <w:tcMar>
+              <w:top w:w="80" w:type="dxa"/>
+              <w:bottom w:w="80" w:type="dxa"/>
+              <w:start w:w="120" w:type="dxa"/>
+              <w:end w:w="120" w:type="dxa"/>
+            </w:tcMar>
+            <w:tcBorders>
+              <w:top w:val="single" w:sz="4" w:space="0" w:color="D9DEE8"/>
+              <w:left w:val="single" w:sz="4" w:space="0" w:color="D9DEE8"/>
+              <w:bottom w:val="single" w:sz="4" w:space="0" w:color="D9DEE8"/>
+              <w:right w:val="single" w:sz="4" w:space="0" w:color="D9DEE8"/>
+            </w:tcBorders>
+            <w:vAlign w:val="center"/>
+          </w:tcPr>
+          <w:p>
+            <w:r>
+              <w:t>Extrai embeddings globais ResNet50.</w:t>
+            </w:r>
+          </w:p>
+        </w:tc>
+        <w:tc>
+          <w:tcPr>
+            <w:tcW w:type="dxa" w:w="2736"/>
+            <w:tcMar>
+              <w:top w:w="80" w:type="dxa"/>
+              <w:bottom w:w="80" w:type="dxa"/>
+              <w:start w:w="120" w:type="dxa"/>
+              <w:end w:w="120" w:type="dxa"/>
+            </w:tcMar>
+            <w:tcBorders>
+              <w:top w:val="single" w:sz="4" w:space="0" w:color="D9DEE8"/>
+              <w:left w:val="single" w:sz="4" w:space="0" w:color="D9DEE8"/>
+              <w:bottom w:val="single" w:sz="4" w:space="0" w:color="D9DEE8"/>
+              <w:right w:val="single" w:sz="4" w:space="0" w:color="D9DEE8"/>
+            </w:tcBorders>
+            <w:vAlign w:val="center"/>
+          </w:tcPr>
+          <w:p>
+            <w:r>
+              <w:t>global_embeddings.npy</w:t>
+            </w:r>
+          </w:p>
+        </w:tc>
+      </w:tr>
+      <w:tr>
+        <w:tc>
+          <w:tcPr>
+            <w:tcW w:type="dxa" w:w="3096"/>
+            <w:tcMar>
+              <w:top w:w="80" w:type="dxa"/>
+              <w:bottom w:w="80" w:type="dxa"/>
+              <w:start w:w="120" w:type="dxa"/>
+              <w:end w:w="120" w:type="dxa"/>
+            </w:tcMar>
+            <w:tcBorders>
+              <w:top w:val="single" w:sz="4" w:space="0" w:color="D9DEE8"/>
+              <w:left w:val="single" w:sz="4" w:space="0" w:color="D9DEE8"/>
+              <w:bottom w:val="single" w:sz="4" w:space="0" w:color="D9DEE8"/>
+              <w:right w:val="single" w:sz="4" w:space="0" w:color="D9DEE8"/>
+            </w:tcBorders>
+            <w:vAlign w:val="center"/>
+          </w:tcPr>
+          <w:p>
+            <w:r>
+              <w:t>scripts/global/02_search_global.py</w:t>
+            </w:r>
+          </w:p>
+        </w:tc>
+        <w:tc>
+          <w:tcPr>
+            <w:tcW w:type="dxa" w:w="3528"/>
+            <w:tcMar>
+              <w:top w:w="80" w:type="dxa"/>
+              <w:bottom w:w="80" w:type="dxa"/>
+              <w:start w:w="120" w:type="dxa"/>
+              <w:end w:w="120" w:type="dxa"/>
+            </w:tcMar>
+            <w:tcBorders>
+              <w:top w:val="single" w:sz="4" w:space="0" w:color="D9DEE8"/>
+              <w:left w:val="single" w:sz="4" w:space="0" w:color="D9DEE8"/>
+              <w:bottom w:val="single" w:sz="4" w:space="0" w:color="D9DEE8"/>
+              <w:right w:val="single" w:sz="4" w:space="0" w:color="D9DEE8"/>
+            </w:tcBorders>
+            <w:vAlign w:val="center"/>
+          </w:tcPr>
+          <w:p>
+            <w:r>
+              <w:t>Busca imagens semelhantes pela imagem inteira.</w:t>
+            </w:r>
+          </w:p>
+        </w:tc>
+        <w:tc>
+          <w:tcPr>
+            <w:tcW w:type="dxa" w:w="2736"/>
+            <w:tcMar>
+              <w:top w:w="80" w:type="dxa"/>
+              <w:bottom w:w="80" w:type="dxa"/>
+              <w:start w:w="120" w:type="dxa"/>
+              <w:end w:w="120" w:type="dxa"/>
+            </w:tcMar>
+            <w:tcBorders>
+              <w:top w:val="single" w:sz="4" w:space="0" w:color="D9DEE8"/>
+              <w:left w:val="single" w:sz="4" w:space="0" w:color="D9DEE8"/>
+              <w:bottom w:val="single" w:sz="4" w:space="0" w:color="D9DEE8"/>
+              <w:right w:val="single" w:sz="4" w:space="0" w:color="D9DEE8"/>
+            </w:tcBorders>
+            <w:vAlign w:val="center"/>
+          </w:tcPr>
+          <w:p>
+            <w:r>
+              <w:t>global_topk_results.csv</w:t>
+            </w:r>
+          </w:p>
+        </w:tc>
+      </w:tr>
+      <w:tr>
+        <w:tc>
+          <w:tcPr>
+            <w:tcW w:type="dxa" w:w="3096"/>
+            <w:tcMar>
+              <w:top w:w="80" w:type="dxa"/>
+              <w:bottom w:w="80" w:type="dxa"/>
+              <w:start w:w="120" w:type="dxa"/>
+              <w:end w:w="120" w:type="dxa"/>
+            </w:tcMar>
+            <w:tcBorders>
+              <w:top w:val="single" w:sz="4" w:space="0" w:color="D9DEE8"/>
+              <w:left w:val="single" w:sz="4" w:space="0" w:color="D9DEE8"/>
+              <w:bottom w:val="single" w:sz="4" w:space="0" w:color="D9DEE8"/>
+              <w:right w:val="single" w:sz="4" w:space="0" w:color="D9DEE8"/>
+            </w:tcBorders>
+            <w:vAlign w:val="center"/>
+          </w:tcPr>
+          <w:p>
+            <w:r>
+              <w:t>scripts/global/03_evaluate_global.py</w:t>
+            </w:r>
+          </w:p>
+        </w:tc>
+        <w:tc>
+          <w:tcPr>
+            <w:tcW w:type="dxa" w:w="3528"/>
+            <w:tcMar>
+              <w:top w:w="80" w:type="dxa"/>
+              <w:bottom w:w="80" w:type="dxa"/>
+              <w:start w:w="120" w:type="dxa"/>
+              <w:end w:w="120" w:type="dxa"/>
+            </w:tcMar>
+            <w:tcBorders>
+              <w:top w:val="single" w:sz="4" w:space="0" w:color="D9DEE8"/>
+              <w:left w:val="single" w:sz="4" w:space="0" w:color="D9DEE8"/>
+              <w:bottom w:val="single" w:sz="4" w:space="0" w:color="D9DEE8"/>
+              <w:right w:val="single" w:sz="4" w:space="0" w:color="D9DEE8"/>
+            </w:tcBorders>
+            <w:vAlign w:val="center"/>
+          </w:tcPr>
+          <w:p>
+            <w:r>
+              <w:t>Avalia o CBIR global.</w:t>
+            </w:r>
+          </w:p>
+        </w:tc>
+        <w:tc>
+          <w:tcPr>
+            <w:tcW w:type="dxa" w:w="2736"/>
+            <w:tcMar>
+              <w:top w:w="80" w:type="dxa"/>
+              <w:bottom w:w="80" w:type="dxa"/>
+              <w:start w:w="120" w:type="dxa"/>
+              <w:end w:w="120" w:type="dxa"/>
+            </w:tcMar>
+            <w:tcBorders>
+              <w:top w:val="single" w:sz="4" w:space="0" w:color="D9DEE8"/>
+              <w:left w:val="single" w:sz="4" w:space="0" w:color="D9DEE8"/>
+              <w:bottom w:val="single" w:sz="4" w:space="0" w:color="D9DEE8"/>
+              <w:right w:val="single" w:sz="4" w:space="0" w:color="D9DEE8"/>
+            </w:tcBorders>
+            <w:vAlign w:val="center"/>
+          </w:tcPr>
+          <w:p>
+            <w:r>
+              <w:t>outputs/reports/*global*</w:t>
+            </w:r>
+          </w:p>
+        </w:tc>
+      </w:tr>
+      <w:tr>
+        <w:tc>
+          <w:tcPr>
+            <w:tcW w:type="dxa" w:w="3096"/>
+            <w:tcMar>
+              <w:top w:w="80" w:type="dxa"/>
+              <w:bottom w:w="80" w:type="dxa"/>
+              <w:start w:w="120" w:type="dxa"/>
+              <w:end w:w="120" w:type="dxa"/>
+            </w:tcMar>
+            <w:tcBorders>
+              <w:top w:val="single" w:sz="4" w:space="0" w:color="D9DEE8"/>
+              <w:left w:val="single" w:sz="4" w:space="0" w:color="D9DEE8"/>
+              <w:bottom w:val="single" w:sz="4" w:space="0" w:color="D9DEE8"/>
+              <w:right w:val="single" w:sz="4" w:space="0" w:color="D9DEE8"/>
+            </w:tcBorders>
+            <w:vAlign w:val="center"/>
+          </w:tcPr>
+          <w:p>
+            <w:r>
+              <w:t>scripts/fusion/02_evaluate_fusion.py</w:t>
+            </w:r>
+          </w:p>
+        </w:tc>
+        <w:tc>
+          <w:tcPr>
+            <w:tcW w:type="dxa" w:w="3528"/>
+            <w:tcMar>
+              <w:top w:w="80" w:type="dxa"/>
+              <w:bottom w:w="80" w:type="dxa"/>
+              <w:start w:w="120" w:type="dxa"/>
+              <w:end w:w="120" w:type="dxa"/>
+            </w:tcMar>
+            <w:tcBorders>
+              <w:top w:val="single" w:sz="4" w:space="0" w:color="D9DEE8"/>
+              <w:left w:val="single" w:sz="4" w:space="0" w:color="D9DEE8"/>
+              <w:bottom w:val="single" w:sz="4" w:space="0" w:color="D9DEE8"/>
+              <w:right w:val="single" w:sz="4" w:space="0" w:color="D9DEE8"/>
+            </w:tcBorders>
+            <w:vAlign w:val="center"/>
+          </w:tcPr>
+          <w:p>
+            <w:r>
+              <w:t>Compara face, global e fusao.</w:t>
+            </w:r>
+          </w:p>
+        </w:tc>
+        <w:tc>
+          <w:tcPr>
+            <w:tcW w:type="dxa" w:w="2736"/>
+            <w:tcMar>
+              <w:top w:w="80" w:type="dxa"/>
+              <w:bottom w:w="80" w:type="dxa"/>
+              <w:start w:w="120" w:type="dxa"/>
+              <w:end w:w="120" w:type="dxa"/>
+            </w:tcMar>
+            <w:tcBorders>
+              <w:top w:val="single" w:sz="4" w:space="0" w:color="D9DEE8"/>
+              <w:left w:val="single" w:sz="4" w:space="0" w:color="D9DEE8"/>
+              <w:bottom w:val="single" w:sz="4" w:space="0" w:color="D9DEE8"/>
+              <w:right w:val="single" w:sz="4" w:space="0" w:color="D9DEE8"/>
+            </w:tcBorders>
+            <w:vAlign w:val="center"/>
+          </w:tcPr>
+          <w:p>
+            <w:r>
+              <w:t>fusion_metrics.csv</w:t>
+            </w:r>
+          </w:p>
+        </w:tc>
+      </w:tr>
+      <w:tr>
+        <w:tc>
+          <w:tcPr>
+            <w:tcW w:type="dxa" w:w="3096"/>
+            <w:tcMar>
+              <w:top w:w="80" w:type="dxa"/>
+              <w:bottom w:w="80" w:type="dxa"/>
+              <w:start w:w="120" w:type="dxa"/>
+              <w:end w:w="120" w:type="dxa"/>
+            </w:tcMar>
+            <w:tcBorders>
+              <w:top w:val="single" w:sz="4" w:space="0" w:color="D9DEE8"/>
+              <w:left w:val="single" w:sz="4" w:space="0" w:color="D9DEE8"/>
+              <w:bottom w:val="single" w:sz="4" w:space="0" w:color="D9DEE8"/>
+              <w:right w:val="single" w:sz="4" w:space="0" w:color="D9DEE8"/>
+            </w:tcBorders>
+            <w:vAlign w:val="center"/>
+          </w:tcPr>
+          <w:p>
+            <w:r>
+              <w:t>scripts/app/streamlit_app.py</w:t>
+            </w:r>
+          </w:p>
+        </w:tc>
+        <w:tc>
+          <w:tcPr>
+            <w:tcW w:type="dxa" w:w="3528"/>
+            <w:tcMar>
+              <w:top w:w="80" w:type="dxa"/>
+              <w:bottom w:w="80" w:type="dxa"/>
+              <w:start w:w="120" w:type="dxa"/>
+              <w:end w:w="120" w:type="dxa"/>
+            </w:tcMar>
+            <w:tcBorders>
+              <w:top w:val="single" w:sz="4" w:space="0" w:color="D9DEE8"/>
+              <w:left w:val="single" w:sz="4" w:space="0" w:color="D9DEE8"/>
+              <w:bottom w:val="single" w:sz="4" w:space="0" w:color="D9DEE8"/>
+              <w:right w:val="single" w:sz="4" w:space="0" w:color="D9DEE8"/>
+            </w:tcBorders>
+            <w:vAlign w:val="center"/>
+          </w:tcPr>
+          <w:p>
+            <w:r>
+              <w:t>Demonstra busca por pessoa, global e fusao.</w:t>
+            </w:r>
+          </w:p>
+        </w:tc>
+        <w:tc>
+          <w:tcPr>
+            <w:tcW w:type="dxa" w:w="2736"/>
+            <w:tcMar>
+              <w:top w:w="80" w:type="dxa"/>
+              <w:bottom w:w="80" w:type="dxa"/>
+              <w:start w:w="120" w:type="dxa"/>
+              <w:end w:w="120" w:type="dxa"/>
+            </w:tcMar>
+            <w:tcBorders>
+              <w:top w:val="single" w:sz="4" w:space="0" w:color="D9DEE8"/>
+              <w:left w:val="single" w:sz="4" w:space="0" w:color="D9DEE8"/>
+              <w:bottom w:val="single" w:sz="4" w:space="0" w:color="D9DEE8"/>
+              <w:right w:val="single" w:sz="4" w:space="0" w:color="D9DEE8"/>
+            </w:tcBorders>
+            <w:vAlign w:val="center"/>
+          </w:tcPr>
+          <w:p>
+            <w:r>
+              <w:t>Interface local em Streamlit</w:t>
+            </w:r>
+          </w:p>
+        </w:tc>
+      </w:tr>
+    </w:tbl>
+    <w:p>
+      <w:pPr>
+        <w:pStyle w:val="Heading1"/>
+      </w:pPr>
+      <w:r>
+        <w:t>5 Avaliacao experimental</w:t>
       </w:r>
     </w:p>
     <w:p>
@@ -2482,15 +2995,36 @@
     </w:tbl>
     <w:p>
       <w:pPr>
-        <w:pStyle w:val="Heading1"/>
+        <w:pStyle w:val="Heading2"/>
       </w:pPr>
       <w:r>
-        <w:t>Interpretacao dos resultados</w:t>
+        <w:t>5.1 Busca facial no Gallagher</w:t>
       </w:r>
     </w:p>
     <w:p>
       <w:r>
-        <w:t>O resultado facial no Gallagher confirma que embeddings faciais sao adequados quando a pergunta do usuario e encontrar uma pessoa especifica. O resultado global no Gallagher foi baixo porque a ResNet50 captura cena, fundo, objetos e composicao visual, nao identidade. Em contrapartida, no INRIA Holidays a mesma abordagem global obteve mAP elevado, mostrando que o modulo esta coerente com a tarefa de CBIR.</w:t>
+        <w:t>O resultado facial no Gallagher confirma que embeddings faciais sao adequados quando a pergunta do usuario e encontrar uma pessoa especifica. O metodo face-only obteve P@5 de 87.8%, P@10 de 81.8% e mAP de 0.632. Como o sistema retorna fotos completas, ele atende ao objetivo pratico de localizar fotografias onde a pessoa aparece, e nao apenas recortes de rosto.</w:t>
+      </w:r>
+    </w:p>
+    <w:p>
+      <w:pPr>
+        <w:pStyle w:val="Heading2"/>
+      </w:pPr>
+      <w:r>
+        <w:t>5.2 CBIR global no INRIA Holidays</w:t>
+      </w:r>
+    </w:p>
+    <w:p>
+      <w:r>
+        <w:t>No INRIA Holidays, o modulo global com ResNet50 obteve mAP de 0.835. Esse resultado indica que a extracao de descritores globais esta coerente com a tarefa de recuperar imagens visualmente semelhantes. No Gallagher, quando a relevancia foi definida por identidade, o mesmo modulo teve desempenho baixo, pois captura cena, fundo, objetos e composicao visual, nao identidade.</w:t>
+      </w:r>
+    </w:p>
+    <w:p>
+      <w:pPr>
+        <w:pStyle w:val="Heading2"/>
+      </w:pPr>
+      <w:r>
+        <w:t>5.3 Fusao face + global</w:t>
       </w:r>
     </w:p>
     <w:p>
@@ -2503,7 +3037,448 @@
         <w:pStyle w:val="Heading1"/>
       </w:pPr>
       <w:r>
-        <w:t>Exemplos visuais</w:t>
+        <w:t>6 Interface e demonstracao</w:t>
+      </w:r>
+    </w:p>
+    <w:p>
+      <w:r>
+        <w:t>Foi criada uma interface minima em Streamlit para demonstrar o funcionamento do sistema. A interface permite enviar uma imagem de consulta, escolher o modo de busca, ajustar Top-K e limiar facial, e visualizar os resultados em uma galeria ranqueada. A interface nao e o foco cientifico da Meta 2, mas serve como prova de conceito e facilita a apresentacao do sistema.</w:t>
+      </w:r>
+    </w:p>
+    <w:p>
+      <w:pPr>
+        <w:pStyle w:val="Heading1"/>
+      </w:pPr>
+      <w:r>
+        <w:t>7 Evidencias e Reprodutibilidade</w:t>
+      </w:r>
+    </w:p>
+    <w:p>
+      <w:r>
+        <w:t>Os experimentos foram executados com ambiente Conda dedicado e suporte a GPU CUDA para os modulos compativeis. Os resultados quantitativos foram salvos em CSV, e os exemplos visuais foram salvos em outputs/reports. Os dados brutos, embeddings e outputs permanecem fora do Git para manter o repositorio leve.</w:t>
+      </w:r>
+    </w:p>
+    <w:tbl>
+      <w:tblPr>
+        <w:tblW w:type="auto" w:w="0"/>
+        <w:jc w:val="left"/>
+        <w:tblLayout w:type="fixed"/>
+        <w:tblLook w:firstColumn="1" w:firstRow="1" w:lastColumn="0" w:lastRow="0" w:noHBand="0" w:noVBand="1" w:val="04A0"/>
+      </w:tblPr>
+      <w:tblGrid>
+        <w:gridCol w:w="4680"/>
+        <w:gridCol w:w="4680"/>
+      </w:tblGrid>
+      <w:tr>
+        <w:trPr>
+          <w:tblHeader w:val="true"/>
+        </w:trPr>
+        <w:tc>
+          <w:tcPr>
+            <w:tcW w:type="dxa" w:w="3024"/>
+            <w:tcMar>
+              <w:top w:w="80" w:type="dxa"/>
+              <w:bottom w:w="80" w:type="dxa"/>
+              <w:start w:w="120" w:type="dxa"/>
+              <w:end w:w="120" w:type="dxa"/>
+            </w:tcMar>
+            <w:tcBorders>
+              <w:top w:val="single" w:sz="4" w:space="0" w:color="D9DEE8"/>
+              <w:left w:val="single" w:sz="4" w:space="0" w:color="D9DEE8"/>
+              <w:bottom w:val="single" w:sz="4" w:space="0" w:color="D9DEE8"/>
+              <w:right w:val="single" w:sz="4" w:space="0" w:color="D9DEE8"/>
+            </w:tcBorders>
+            <w:vAlign w:val="center"/>
+            <w:shd w:fill="F2F4F7"/>
+          </w:tcPr>
+          <w:p>
+            <w:pPr>
+              <w:jc w:val="left"/>
+            </w:pPr>
+            <w:r>
+              <w:rPr>
+                <w:b/>
+              </w:rPr>
+              <w:t>Evidencia</w:t>
+            </w:r>
+          </w:p>
+        </w:tc>
+        <w:tc>
+          <w:tcPr>
+            <w:tcW w:type="dxa" w:w="6336"/>
+            <w:tcMar>
+              <w:top w:w="80" w:type="dxa"/>
+              <w:bottom w:w="80" w:type="dxa"/>
+              <w:start w:w="120" w:type="dxa"/>
+              <w:end w:w="120" w:type="dxa"/>
+            </w:tcMar>
+            <w:tcBorders>
+              <w:top w:val="single" w:sz="4" w:space="0" w:color="D9DEE8"/>
+              <w:left w:val="single" w:sz="4" w:space="0" w:color="D9DEE8"/>
+              <w:bottom w:val="single" w:sz="4" w:space="0" w:color="D9DEE8"/>
+              <w:right w:val="single" w:sz="4" w:space="0" w:color="D9DEE8"/>
+            </w:tcBorders>
+            <w:vAlign w:val="center"/>
+            <w:shd w:fill="F2F4F7"/>
+          </w:tcPr>
+          <w:p>
+            <w:pPr>
+              <w:jc w:val="left"/>
+            </w:pPr>
+            <w:r>
+              <w:rPr>
+                <w:b/>
+              </w:rPr>
+              <w:t>Caminho</w:t>
+            </w:r>
+          </w:p>
+        </w:tc>
+      </w:tr>
+      <w:tr>
+        <w:tc>
+          <w:tcPr>
+            <w:tcW w:type="dxa" w:w="3024"/>
+            <w:tcMar>
+              <w:top w:w="80" w:type="dxa"/>
+              <w:bottom w:w="80" w:type="dxa"/>
+              <w:start w:w="120" w:type="dxa"/>
+              <w:end w:w="120" w:type="dxa"/>
+            </w:tcMar>
+            <w:tcBorders>
+              <w:top w:val="single" w:sz="4" w:space="0" w:color="D9DEE8"/>
+              <w:left w:val="single" w:sz="4" w:space="0" w:color="D9DEE8"/>
+              <w:bottom w:val="single" w:sz="4" w:space="0" w:color="D9DEE8"/>
+              <w:right w:val="single" w:sz="4" w:space="0" w:color="D9DEE8"/>
+            </w:tcBorders>
+            <w:vAlign w:val="center"/>
+          </w:tcPr>
+          <w:p>
+            <w:r>
+              <w:t>Metricas faciais</w:t>
+            </w:r>
+          </w:p>
+        </w:tc>
+        <w:tc>
+          <w:tcPr>
+            <w:tcW w:type="dxa" w:w="6336"/>
+            <w:tcMar>
+              <w:top w:w="80" w:type="dxa"/>
+              <w:bottom w:w="80" w:type="dxa"/>
+              <w:start w:w="120" w:type="dxa"/>
+              <w:end w:w="120" w:type="dxa"/>
+            </w:tcMar>
+            <w:tcBorders>
+              <w:top w:val="single" w:sz="4" w:space="0" w:color="D9DEE8"/>
+              <w:left w:val="single" w:sz="4" w:space="0" w:color="D9DEE8"/>
+              <w:bottom w:val="single" w:sz="4" w:space="0" w:color="D9DEE8"/>
+              <w:right w:val="single" w:sz="4" w:space="0" w:color="D9DEE8"/>
+            </w:tcBorders>
+            <w:vAlign w:val="center"/>
+          </w:tcPr>
+          <w:p>
+            <w:r>
+              <w:t>outputs/reports/gallagher_face/face_metrics.csv</w:t>
+            </w:r>
+          </w:p>
+        </w:tc>
+      </w:tr>
+      <w:tr>
+        <w:tc>
+          <w:tcPr>
+            <w:tcW w:type="dxa" w:w="3024"/>
+            <w:tcMar>
+              <w:top w:w="80" w:type="dxa"/>
+              <w:bottom w:w="80" w:type="dxa"/>
+              <w:start w:w="120" w:type="dxa"/>
+              <w:end w:w="120" w:type="dxa"/>
+            </w:tcMar>
+            <w:tcBorders>
+              <w:top w:val="single" w:sz="4" w:space="0" w:color="D9DEE8"/>
+              <w:left w:val="single" w:sz="4" w:space="0" w:color="D9DEE8"/>
+              <w:bottom w:val="single" w:sz="4" w:space="0" w:color="D9DEE8"/>
+              <w:right w:val="single" w:sz="4" w:space="0" w:color="D9DEE8"/>
+            </w:tcBorders>
+            <w:vAlign w:val="center"/>
+          </w:tcPr>
+          <w:p>
+            <w:r>
+              <w:t>Metricas globais Gallagher</w:t>
+            </w:r>
+          </w:p>
+        </w:tc>
+        <w:tc>
+          <w:tcPr>
+            <w:tcW w:type="dxa" w:w="6336"/>
+            <w:tcMar>
+              <w:top w:w="80" w:type="dxa"/>
+              <w:bottom w:w="80" w:type="dxa"/>
+              <w:start w:w="120" w:type="dxa"/>
+              <w:end w:w="120" w:type="dxa"/>
+            </w:tcMar>
+            <w:tcBorders>
+              <w:top w:val="single" w:sz="4" w:space="0" w:color="D9DEE8"/>
+              <w:left w:val="single" w:sz="4" w:space="0" w:color="D9DEE8"/>
+              <w:bottom w:val="single" w:sz="4" w:space="0" w:color="D9DEE8"/>
+              <w:right w:val="single" w:sz="4" w:space="0" w:color="D9DEE8"/>
+            </w:tcBorders>
+            <w:vAlign w:val="center"/>
+          </w:tcPr>
+          <w:p>
+            <w:r>
+              <w:t>outputs/reports/gallagher_global_person/global_metrics.csv</w:t>
+            </w:r>
+          </w:p>
+        </w:tc>
+      </w:tr>
+      <w:tr>
+        <w:tc>
+          <w:tcPr>
+            <w:tcW w:type="dxa" w:w="3024"/>
+            <w:tcMar>
+              <w:top w:w="80" w:type="dxa"/>
+              <w:bottom w:w="80" w:type="dxa"/>
+              <w:start w:w="120" w:type="dxa"/>
+              <w:end w:w="120" w:type="dxa"/>
+            </w:tcMar>
+            <w:tcBorders>
+              <w:top w:val="single" w:sz="4" w:space="0" w:color="D9DEE8"/>
+              <w:left w:val="single" w:sz="4" w:space="0" w:color="D9DEE8"/>
+              <w:bottom w:val="single" w:sz="4" w:space="0" w:color="D9DEE8"/>
+              <w:right w:val="single" w:sz="4" w:space="0" w:color="D9DEE8"/>
+            </w:tcBorders>
+            <w:vAlign w:val="center"/>
+          </w:tcPr>
+          <w:p>
+            <w:r>
+              <w:t>Metricas globais Holidays</w:t>
+            </w:r>
+          </w:p>
+        </w:tc>
+        <w:tc>
+          <w:tcPr>
+            <w:tcW w:type="dxa" w:w="6336"/>
+            <w:tcMar>
+              <w:top w:w="80" w:type="dxa"/>
+              <w:bottom w:w="80" w:type="dxa"/>
+              <w:start w:w="120" w:type="dxa"/>
+              <w:end w:w="120" w:type="dxa"/>
+            </w:tcMar>
+            <w:tcBorders>
+              <w:top w:val="single" w:sz="4" w:space="0" w:color="D9DEE8"/>
+              <w:left w:val="single" w:sz="4" w:space="0" w:color="D9DEE8"/>
+              <w:bottom w:val="single" w:sz="4" w:space="0" w:color="D9DEE8"/>
+              <w:right w:val="single" w:sz="4" w:space="0" w:color="D9DEE8"/>
+            </w:tcBorders>
+            <w:vAlign w:val="center"/>
+          </w:tcPr>
+          <w:p>
+            <w:r>
+              <w:t>outputs/reports/holidays_global/global_metrics.csv</w:t>
+            </w:r>
+          </w:p>
+        </w:tc>
+      </w:tr>
+      <w:tr>
+        <w:tc>
+          <w:tcPr>
+            <w:tcW w:type="dxa" w:w="3024"/>
+            <w:tcMar>
+              <w:top w:w="80" w:type="dxa"/>
+              <w:bottom w:w="80" w:type="dxa"/>
+              <w:start w:w="120" w:type="dxa"/>
+              <w:end w:w="120" w:type="dxa"/>
+            </w:tcMar>
+            <w:tcBorders>
+              <w:top w:val="single" w:sz="4" w:space="0" w:color="D9DEE8"/>
+              <w:left w:val="single" w:sz="4" w:space="0" w:color="D9DEE8"/>
+              <w:bottom w:val="single" w:sz="4" w:space="0" w:color="D9DEE8"/>
+              <w:right w:val="single" w:sz="4" w:space="0" w:color="D9DEE8"/>
+            </w:tcBorders>
+            <w:vAlign w:val="center"/>
+          </w:tcPr>
+          <w:p>
+            <w:r>
+              <w:t>Metricas de fusao</w:t>
+            </w:r>
+          </w:p>
+        </w:tc>
+        <w:tc>
+          <w:tcPr>
+            <w:tcW w:type="dxa" w:w="6336"/>
+            <w:tcMar>
+              <w:top w:w="80" w:type="dxa"/>
+              <w:bottom w:w="80" w:type="dxa"/>
+              <w:start w:w="120" w:type="dxa"/>
+              <w:end w:w="120" w:type="dxa"/>
+            </w:tcMar>
+            <w:tcBorders>
+              <w:top w:val="single" w:sz="4" w:space="0" w:color="D9DEE8"/>
+              <w:left w:val="single" w:sz="4" w:space="0" w:color="D9DEE8"/>
+              <w:bottom w:val="single" w:sz="4" w:space="0" w:color="D9DEE8"/>
+              <w:right w:val="single" w:sz="4" w:space="0" w:color="D9DEE8"/>
+            </w:tcBorders>
+            <w:vAlign w:val="center"/>
+          </w:tcPr>
+          <w:p>
+            <w:r>
+              <w:t>outputs/reports/gallagher_fusion/fusion_metrics.csv</w:t>
+            </w:r>
+          </w:p>
+        </w:tc>
+      </w:tr>
+      <w:tr>
+        <w:tc>
+          <w:tcPr>
+            <w:tcW w:type="dxa" w:w="3024"/>
+            <w:tcMar>
+              <w:top w:w="80" w:type="dxa"/>
+              <w:bottom w:w="80" w:type="dxa"/>
+              <w:start w:w="120" w:type="dxa"/>
+              <w:end w:w="120" w:type="dxa"/>
+            </w:tcMar>
+            <w:tcBorders>
+              <w:top w:val="single" w:sz="4" w:space="0" w:color="D9DEE8"/>
+              <w:left w:val="single" w:sz="4" w:space="0" w:color="D9DEE8"/>
+              <w:bottom w:val="single" w:sz="4" w:space="0" w:color="D9DEE8"/>
+              <w:right w:val="single" w:sz="4" w:space="0" w:color="D9DEE8"/>
+            </w:tcBorders>
+            <w:vAlign w:val="center"/>
+          </w:tcPr>
+          <w:p>
+            <w:r>
+              <w:t>Tabela comparativa</w:t>
+            </w:r>
+          </w:p>
+        </w:tc>
+        <w:tc>
+          <w:tcPr>
+            <w:tcW w:type="dxa" w:w="6336"/>
+            <w:tcMar>
+              <w:top w:w="80" w:type="dxa"/>
+              <w:bottom w:w="80" w:type="dxa"/>
+              <w:start w:w="120" w:type="dxa"/>
+              <w:end w:w="120" w:type="dxa"/>
+            </w:tcMar>
+            <w:tcBorders>
+              <w:top w:val="single" w:sz="4" w:space="0" w:color="D9DEE8"/>
+              <w:left w:val="single" w:sz="4" w:space="0" w:color="D9DEE8"/>
+              <w:bottom w:val="single" w:sz="4" w:space="0" w:color="D9DEE8"/>
+              <w:right w:val="single" w:sz="4" w:space="0" w:color="D9DEE8"/>
+            </w:tcBorders>
+            <w:vAlign w:val="center"/>
+          </w:tcPr>
+          <w:p>
+            <w:r>
+              <w:t>outputs/reports/comparison/gallagher_face_global_fusion_comparison.csv</w:t>
+            </w:r>
+          </w:p>
+        </w:tc>
+      </w:tr>
+      <w:tr>
+        <w:tc>
+          <w:tcPr>
+            <w:tcW w:type="dxa" w:w="3024"/>
+            <w:tcMar>
+              <w:top w:w="80" w:type="dxa"/>
+              <w:bottom w:w="80" w:type="dxa"/>
+              <w:start w:w="120" w:type="dxa"/>
+              <w:end w:w="120" w:type="dxa"/>
+            </w:tcMar>
+            <w:tcBorders>
+              <w:top w:val="single" w:sz="4" w:space="0" w:color="D9DEE8"/>
+              <w:left w:val="single" w:sz="4" w:space="0" w:color="D9DEE8"/>
+              <w:bottom w:val="single" w:sz="4" w:space="0" w:color="D9DEE8"/>
+              <w:right w:val="single" w:sz="4" w:space="0" w:color="D9DEE8"/>
+            </w:tcBorders>
+            <w:vAlign w:val="center"/>
+          </w:tcPr>
+          <w:p>
+            <w:r>
+              <w:t>Interface</w:t>
+            </w:r>
+          </w:p>
+        </w:tc>
+        <w:tc>
+          <w:tcPr>
+            <w:tcW w:type="dxa" w:w="6336"/>
+            <w:tcMar>
+              <w:top w:w="80" w:type="dxa"/>
+              <w:bottom w:w="80" w:type="dxa"/>
+              <w:start w:w="120" w:type="dxa"/>
+              <w:end w:w="120" w:type="dxa"/>
+            </w:tcMar>
+            <w:tcBorders>
+              <w:top w:val="single" w:sz="4" w:space="0" w:color="D9DEE8"/>
+              <w:left w:val="single" w:sz="4" w:space="0" w:color="D9DEE8"/>
+              <w:bottom w:val="single" w:sz="4" w:space="0" w:color="D9DEE8"/>
+              <w:right w:val="single" w:sz="4" w:space="0" w:color="D9DEE8"/>
+            </w:tcBorders>
+            <w:vAlign w:val="center"/>
+          </w:tcPr>
+          <w:p>
+            <w:r>
+              <w:t>scripts/app/streamlit_app.py</w:t>
+            </w:r>
+          </w:p>
+        </w:tc>
+      </w:tr>
+    </w:tbl>
+    <w:p>
+      <w:pPr>
+        <w:pStyle w:val="ListNumber"/>
+      </w:pPr>
+      <w:r>
+        <w:t>Indexar rostos: python scripts/face/01_index_faces.py --input-dir &lt;pasta&gt; --output-dir &lt;saida&gt; --device cuda</w:t>
+      </w:r>
+    </w:p>
+    <w:p>
+      <w:pPr>
+        <w:pStyle w:val="ListNumber"/>
+      </w:pPr>
+      <w:r>
+        <w:t>Indexar imagens globais: python scripts/global/01_index_global_resnet.py --input-dir &lt;pasta&gt; --output-dir &lt;saida&gt; --device cuda</w:t>
+      </w:r>
+    </w:p>
+    <w:p>
+      <w:pPr>
+        <w:pStyle w:val="ListNumber"/>
+      </w:pPr>
+      <w:r>
+        <w:t>Avaliar face, global e fusao com os scripts 03_evaluate_face.py, 03_evaluate_global.py e 02_evaluate_fusion.py.</w:t>
+      </w:r>
+    </w:p>
+    <w:p>
+      <w:pPr>
+        <w:pStyle w:val="ListNumber"/>
+      </w:pPr>
+      <w:r>
+        <w:t>Executar a interface: python -m streamlit run scripts/app/streamlit_app.py --server.port 8501</w:t>
+      </w:r>
+    </w:p>
+    <w:p>
+      <w:pPr>
+        <w:pStyle w:val="Heading1"/>
+      </w:pPr>
+      <w:r>
+        <w:t>8 Resultados e Discussao</w:t>
+      </w:r>
+    </w:p>
+    <w:p>
+      <w:r>
+        <w:t>Os resultados mostram que a busca facial e a estrategia mais adequada quando o objetivo e recuperar fotografias de uma pessoa especifica. Ja a busca global e mais apropriada quando o objetivo e encontrar imagens parecidas pela cena ou composicao visual. A fusao simples nao superou a busca facial isolada no Gallagher, mas esse resultado e relevante: ele demonstra que combinar sinais heterogeneos sem calibracao pode prejudicar o ranking.</w:t>
+      </w:r>
+    </w:p>
+    <w:p>
+      <w:r>
+        <w:t>Para fins de artigo, a principal contribuicao nao e afirmar que a fusao sempre melhora, mas mostrar uma avaliacao comparativa clara entre face-only, global-only e fusao tardia. A conclusao tecnica e que os modulos devem permanecer separados na interface e que a fusao deve ser tratada como recurso experimental.</w:t>
+      </w:r>
+    </w:p>
+    <w:p>
+      <w:pPr>
+        <w:pStyle w:val="Heading2"/>
+      </w:pPr>
+      <w:r>
+        <w:t>8.1 Exemplos visuais</w:t>
       </w:r>
     </w:p>
     <w:p>
@@ -2616,10 +3591,10 @@
     </w:p>
     <w:p>
       <w:pPr>
-        <w:pStyle w:val="Heading1"/>
+        <w:pStyle w:val="Heading2"/>
       </w:pPr>
       <w:r>
-        <w:t>Criterios de aceite</w:t>
+        <w:t>8.2 Criterios de aceite</w:t>
       </w:r>
     </w:p>
     <w:tbl>
@@ -3253,55 +4228,7 @@
         <w:pStyle w:val="Heading1"/>
       </w:pPr>
       <w:r>
-        <w:t>Limitacoes e proximos passos</w:t>
-      </w:r>
-    </w:p>
-    <w:p>
-      <w:pPr>
-        <w:pStyle w:val="ListBullet"/>
-      </w:pPr>
-      <w:r>
-        <w:t>Avaliacao ainda pequena para busca facial, com 20 consultas no Gallagher.</w:t>
-      </w:r>
-    </w:p>
-    <w:p>
-      <w:pPr>
-        <w:pStyle w:val="ListBullet"/>
-      </w:pPr>
-      <w:r>
-        <w:t>A fusao usa regra linear simples; ainda nao ha aprendizado de pesos ou normalizacao mais sofisticada.</w:t>
-      </w:r>
-    </w:p>
-    <w:p>
-      <w:pPr>
-        <w:pStyle w:val="ListBullet"/>
-      </w:pPr>
-      <w:r>
-        <w:t>A interface seleciona automaticamente o maior rosto da consulta; uma versao produto deve permitir escolher o rosto.</w:t>
-      </w:r>
-    </w:p>
-    <w:p>
-      <w:pPr>
-        <w:pStyle w:val="ListBullet"/>
-      </w:pPr>
-      <w:r>
-        <w:t>Ainda nao ha FAISS, CLIP, criptografia de embeddings, avaliacao de vies demografico ou acervo de milhoes de imagens.</w:t>
-      </w:r>
-    </w:p>
-    <w:p>
-      <w:pPr>
-        <w:pStyle w:val="ListBullet"/>
-      </w:pPr>
-      <w:r>
-        <w:t>Para artigo, o texto deve enfatizar a comparacao experimental e nao prometer escala ou produto final completo.</w:t>
-      </w:r>
-    </w:p>
-    <w:p>
-      <w:pPr>
-        <w:pStyle w:val="Heading1"/>
-      </w:pPr>
-      <w:r>
-        <w:t>Conclusao da Meta 2</w:t>
+        <w:t>9 Conclusao</w:t>
       </w:r>
     </w:p>
     <w:p>
@@ -3314,7 +4241,71 @@
         <w:pStyle w:val="Heading1"/>
       </w:pPr>
       <w:r>
-        <w:t>Referencias</w:t>
+        <w:t>10 Proximos Passos</w:t>
+      </w:r>
+    </w:p>
+    <w:p>
+      <w:pPr>
+        <w:pStyle w:val="ListBullet"/>
+      </w:pPr>
+      <w:r>
+        <w:t>Ampliar a avaliacao facial com mais consultas e, se possivel, outro acervo de eventos.</w:t>
+      </w:r>
+    </w:p>
+    <w:p>
+      <w:pPr>
+        <w:pStyle w:val="ListBullet"/>
+      </w:pPr>
+      <w:r>
+        <w:t>Permitir selecao manual do rosto de consulta quando uma imagem possuir mais de uma face.</w:t>
+      </w:r>
+    </w:p>
+    <w:p>
+      <w:pPr>
+        <w:pStyle w:val="ListBullet"/>
+      </w:pPr>
+      <w:r>
+        <w:t>Testar CLIP como descritor global complementar ao baseline ResNet50.</w:t>
+      </w:r>
+    </w:p>
+    <w:p>
+      <w:pPr>
+        <w:pStyle w:val="ListBullet"/>
+      </w:pPr>
+      <w:r>
+        <w:t>Adicionar FAISS para acelerar a busca em acervos maiores.</w:t>
+      </w:r>
+    </w:p>
+    <w:p>
+      <w:pPr>
+        <w:pStyle w:val="ListBullet"/>
+      </w:pPr>
+      <w:r>
+        <w:t>Investigar normalizacao de scores e pesos aprendidos para melhorar a fusao.</w:t>
+      </w:r>
+    </w:p>
+    <w:p>
+      <w:pPr>
+        <w:pStyle w:val="ListBullet"/>
+      </w:pPr>
+      <w:r>
+        <w:t>Documentar cuidados de privacidade, vies e armazenamento seguro de embeddings faciais.</w:t>
+      </w:r>
+    </w:p>
+    <w:p>
+      <w:pPr>
+        <w:pStyle w:val="ListBullet"/>
+      </w:pPr>
+      <w:r>
+        <w:t>Converter o rascunho tecnico em artigo no formato exigido pelo evento ou periodico escolhido.</w:t>
+      </w:r>
+    </w:p>
+    <w:p>
+      <w:pPr>
+        <w:pStyle w:val="Heading1"/>
+      </w:pPr>
+      <w:r>
+        <w:t>11 Referencias</w:t>
       </w:r>
     </w:p>
     <w:p>

</xml_diff>